<commit_message>
changes from mazhar branch
</commit_message>
<xml_diff>
--- a/dna-sample.docx
+++ b/dna-sample.docx
@@ -354,21 +354,14 @@
         <w:t xml:space="preserve">Some changes </w:t>
       </w:r>
       <w:r>
-        <w:t xml:space="preserve"> from </w:t>
+        <w:t xml:space="preserve"> from mazhar ahmad</w:t>
       </w:r>
-      <w:proofErr w:type="spellStart"/>
+    </w:p>
+    <w:p/>
+    <w:p>
       <w:r>
-        <w:t>mazhar</w:t>
+        <w:t>Changes from mazhars branch</w:t>
       </w:r>
-      <w:proofErr w:type="spellEnd"/>
-      <w:r>
-        <w:t xml:space="preserve"> </w:t>
-      </w:r>
-      <w:proofErr w:type="spellStart"/>
-      <w:r>
-        <w:t>ahmad</w:t>
-      </w:r>
-      <w:proofErr w:type="spellEnd"/>
     </w:p>
     <w:p/>
     <w:p/>

</xml_diff>